<commit_message>
Livrables 2.21 : cahier de recette sans détails techniques, cas manuels dans l'ordre ; spécifications SF-05
Co-Authored-By: Claude Opus 5.5 <noreply@anthropic.com>
Claude-Session: https://claude.ai/code/session_0187v8SY8uiT6dnWqjjqJYb6
</commit_message>
<xml_diff>
--- a/docs/livrables/ProjectDesk_Cahier_de_recette_v2.21.docx
+++ b/docs/livrables/ProjectDesk_Cahier_de_recette_v2.21.docx
@@ -3388,7 +3388,7 @@
                 <w:sz w:val="18"/>
                 <w:szCs w:val="18"/>
               </w:rPr>
-              <w:t xml:space="preserve">Gestion des ressources › Liste : colonne Anniversaire (jour et mois, sans l’année) et anniversaires du mois — Thomas Bernard, Sarah Petit</w:t>
+              <w:t xml:space="preserve">Gestion des ressources › Liste : colonne Anniversaire (jour et mois, sans l’année) et anniversaires du mois</w:t>
             </w:r>
           </w:p>
         </w:tc>
@@ -3481,7 +3481,7 @@
                 <w:sz w:val="18"/>
                 <w:szCs w:val="18"/>
               </w:rPr>
-              <w:t xml:space="preserve">Gestion des ressources › Liste : filtres équipe, recherche et statut — 3 / 1 / 0</w:t>
+              <w:t xml:space="preserve">Gestion des ressources › Liste : filtres équipe, recherche et statut</w:t>
             </w:r>
           </w:p>
         </w:tc>
@@ -3574,7 +3574,7 @@
                 <w:sz w:val="18"/>
                 <w:szCs w:val="18"/>
               </w:rPr>
-              <w:t xml:space="preserve">Administration › Rôles et accès : matrice sans le créateur, sections Suivi de mes équipes / Mon dashboard, modifiable — {"roles":["Administrateur","Direction","Responsable d’équipe","Projet","Utilisateur","Lecture seule"],"sections":["Périmètrece que couvre le rôle\n          ToutSa direction et ses équipesSon équipeSes projetsLui-même et ses projetsCe qu’on lui ouvre","Suivi de mes équipes","Mon dashboard"]}</w:t>
+              <w:t xml:space="preserve">Administration › Rôles et accès : matrice sans le créateur, sections Suivi de mes équipes / Mon dashboard, modifiable</w:t>
             </w:r>
           </w:p>
         </w:tc>
@@ -4039,7 +4039,7 @@
                 <w:sz w:val="18"/>
                 <w:szCs w:val="18"/>
               </w:rPr>
-              <w:t xml:space="preserve">Matrice des droits : une ligne par droit, garde-fou Administrateur × Rôles, niveau enregistré ; vue « qui a quel rôle » — {"matrice":true,"verrou":true,"enregistre":true}</w:t>
+              <w:t xml:space="preserve">Matrice des droits : une ligne par droit, garde-fou Administrateur × Rôles, niveau enregistré ; vue « qui a quel rôle »</w:t>
             </w:r>
           </w:p>
         </w:tc>
@@ -10177,7 +10177,7 @@
                 <w:sz w:val="18"/>
                 <w:szCs w:val="18"/>
               </w:rPr>
-              <w:t xml:space="preserve">Personne partie le 30/09 : absente des écrans d’octobre, présente en septembre et dans le récap annuel — visible en octobre dans :  · fin = 2026-09-30 · Thomas Bernard</w:t>
+              <w:t xml:space="preserve">Personne partie le 30/09 : absente des écrans d’octobre, présente en septembre et dans le récap annuel</w:t>
             </w:r>
           </w:p>
         </w:tc>
@@ -10363,7 +10363,7 @@
                 <w:sz w:val="18"/>
                 <w:szCs w:val="18"/>
               </w:rPr>
-              <w:t xml:space="preserve">Rôles : fiche en lecture, choix dans Administration › Rôles par un administrateur (responsable, membre, rôle prévu sans compte) — {"accesInitial":"Utilisateur","ficheEnLecture":true,"ongletRoles":true,"thomasResponsable":true,"thomasMembre":true,"leaPrevue":true}</w:t>
+              <w:t xml:space="preserve">Rôles : fiche en lecture, choix dans Administration › Rôles par un administrateur (responsable, membre, rôle prévu sans compte)</w:t>
             </w:r>
           </w:p>
         </w:tc>
@@ -10456,7 +10456,7 @@
                 <w:sz w:val="18"/>
                 <w:szCs w:val="18"/>
               </w:rPr>
-              <w:t xml:space="preserve">Rôles : les six rôles (Administrateur, Direction, Responsable, Projet, Utilisateur, Lecture seule) ; Lecture seule appliquée sans compte — {"optionsRoles":"admin,direction,responsable,projet,utilisateur,lecture","leaLecture":true,"thomasDirection":true,"idHugo":true}</w:t>
+              <w:t xml:space="preserve">Rôles : les six rôles (Administrateur, Direction, Responsable, Projet, Utilisateur, Lecture seule) ; Lecture seule appliquée sans compte</w:t>
             </w:r>
           </w:p>
         </w:tc>
@@ -13990,7 +13990,7 @@
                 <w:sz w:val="18"/>
                 <w:szCs w:val="18"/>
               </w:rPr>
-              <w:t xml:space="preserve">Matrice par menu : menu de Suivi masqué si « Non », repli sur l’ancien droit avant la migration 037 — {"masque":true,"repli":true}</w:t>
+              <w:t xml:space="preserve">Matrice par menu : menu de Suivi masqué si « Non », repli sur l’ancien droit avant la migration 037</w:t>
             </w:r>
           </w:p>
         </w:tc>
@@ -16653,7 +16653,7 @@
                 <w:sz w:val="18"/>
                 <w:szCs w:val="18"/>
               </w:rPr>
-              <w:t xml:space="preserve">RM-16</w:t>
+              <w:t xml:space="preserve">RM-14</w:t>
             </w:r>
           </w:p>
         </w:tc>
@@ -16675,7 +16675,7 @@
                 <w:sz w:val="18"/>
                 <w:szCs w:val="18"/>
               </w:rPr>
-              <w:t xml:space="preserve">Droits</w:t>
+              <w:t xml:space="preserve">Affichage</w:t>
             </w:r>
           </w:p>
         </w:tc>
@@ -16697,7 +16697,7 @@
                 <w:sz w:val="18"/>
                 <w:szCs w:val="18"/>
               </w:rPr>
-              <w:t xml:space="preserve">Matrice des droits : passer un menu puis un onglet à « Non » pour un rôle, se reconnecter avec ce rôle</w:t>
+              <w:t xml:space="preserve">Ouvrir l’application sur tablette / Galaxy Z Fold déplié</w:t>
             </w:r>
           </w:p>
         </w:tc>
@@ -16719,7 +16719,7 @@
                 <w:sz w:val="18"/>
                 <w:szCs w:val="18"/>
               </w:rPr>
-              <w:t xml:space="preserve">Menu / onglet masqués ; remis à « Oui », ils réapparaissent (onglets : après migration 038)</w:t>
+              <w:t xml:space="preserve">Menu en tiroir (☰), pas de débordement</w:t>
             </w:r>
           </w:p>
         </w:tc>
@@ -16741,7 +16741,7 @@
                 <w:sz w:val="18"/>
                 <w:szCs w:val="18"/>
               </w:rPr>
-              <w:t xml:space="preserve">Administrateur</w:t>
+              <w:t xml:space="preserve">Tout utilisateur</w:t>
             </w:r>
           </w:p>
         </w:tc>
@@ -16790,7 +16790,7 @@
                 <w:sz w:val="18"/>
                 <w:szCs w:val="18"/>
               </w:rPr>
-              <w:t xml:space="preserve">RM-17</w:t>
+              <w:t xml:space="preserve">RM-15</w:t>
             </w:r>
           </w:p>
         </w:tc>
@@ -16812,7 +16812,7 @@
                 <w:sz w:val="18"/>
                 <w:szCs w:val="18"/>
               </w:rPr>
-              <w:t xml:space="preserve">Ressources</w:t>
+              <w:t xml:space="preserve">Performance</w:t>
             </w:r>
           </w:p>
         </w:tc>
@@ -16834,7 +16834,7 @@
                 <w:sz w:val="18"/>
                 <w:szCs w:val="18"/>
               </w:rPr>
-              <w:t xml:space="preserve">Saisir une date de naissance dans une fiche, ouvrir Gestion des ressources</w:t>
+              <w:t xml:space="preserve">Ouvrir chaque menu avec les données réelles</w:t>
             </w:r>
           </w:p>
         </w:tc>
@@ -16856,7 +16856,7 @@
                 <w:sz w:val="18"/>
                 <w:szCs w:val="18"/>
               </w:rPr>
-              <w:t xml:space="preserve">Jour et mois affichés (sans l’année) ; 🎂 dans le calendrier le jour J</w:t>
+              <w:t xml:space="preserve">Affichage en moins de 2 secondes</w:t>
             </w:r>
           </w:p>
         </w:tc>
@@ -16878,7 +16878,7 @@
                 <w:sz w:val="18"/>
                 <w:szCs w:val="18"/>
               </w:rPr>
-              <w:t xml:space="preserve">Administrateur</w:t>
+              <w:t xml:space="preserve">Tout utilisateur</w:t>
             </w:r>
           </w:p>
         </w:tc>
@@ -16927,7 +16927,7 @@
                 <w:sz w:val="18"/>
                 <w:szCs w:val="18"/>
               </w:rPr>
-              <w:t xml:space="preserve">RM-14</w:t>
+              <w:t xml:space="preserve">RM-16</w:t>
             </w:r>
           </w:p>
         </w:tc>
@@ -16949,7 +16949,7 @@
                 <w:sz w:val="18"/>
                 <w:szCs w:val="18"/>
               </w:rPr>
-              <w:t xml:space="preserve">Affichage</w:t>
+              <w:t xml:space="preserve">Droits</w:t>
             </w:r>
           </w:p>
         </w:tc>
@@ -16971,7 +16971,7 @@
                 <w:sz w:val="18"/>
                 <w:szCs w:val="18"/>
               </w:rPr>
-              <w:t xml:space="preserve">Ouvrir l’application sur tablette / Galaxy Z Fold déplié</w:t>
+              <w:t xml:space="preserve">Matrice des droits : passer un menu puis un onglet à « Non » pour un rôle, se reconnecter avec ce rôle</w:t>
             </w:r>
           </w:p>
         </w:tc>
@@ -16993,7 +16993,7 @@
                 <w:sz w:val="18"/>
                 <w:szCs w:val="18"/>
               </w:rPr>
-              <w:t xml:space="preserve">Menu en tiroir (☰), pas de débordement</w:t>
+              <w:t xml:space="preserve">Menu / onglet masqués ; remis à « Oui », ils réapparaissent (onglets : après migration 038)</w:t>
             </w:r>
           </w:p>
         </w:tc>
@@ -17015,7 +17015,7 @@
                 <w:sz w:val="18"/>
                 <w:szCs w:val="18"/>
               </w:rPr>
-              <w:t xml:space="preserve">Tout utilisateur</w:t>
+              <w:t xml:space="preserve">Administrateur</w:t>
             </w:r>
           </w:p>
         </w:tc>
@@ -17064,7 +17064,7 @@
                 <w:sz w:val="18"/>
                 <w:szCs w:val="18"/>
               </w:rPr>
-              <w:t xml:space="preserve">RM-15</w:t>
+              <w:t xml:space="preserve">RM-17</w:t>
             </w:r>
           </w:p>
         </w:tc>
@@ -17086,7 +17086,7 @@
                 <w:sz w:val="18"/>
                 <w:szCs w:val="18"/>
               </w:rPr>
-              <w:t xml:space="preserve">Performance</w:t>
+              <w:t xml:space="preserve">Ressources</w:t>
             </w:r>
           </w:p>
         </w:tc>
@@ -17108,7 +17108,7 @@
                 <w:sz w:val="18"/>
                 <w:szCs w:val="18"/>
               </w:rPr>
-              <w:t xml:space="preserve">Ouvrir chaque menu avec les données réelles</w:t>
+              <w:t xml:space="preserve">Saisir une date de naissance dans une fiche, ouvrir Gestion des ressources</w:t>
             </w:r>
           </w:p>
         </w:tc>
@@ -17130,7 +17130,7 @@
                 <w:sz w:val="18"/>
                 <w:szCs w:val="18"/>
               </w:rPr>
-              <w:t xml:space="preserve">Affichage en moins de 2 secondes</w:t>
+              <w:t xml:space="preserve">Jour et mois affichés (sans l’année) ; 🎂 dans le calendrier le jour J</w:t>
             </w:r>
           </w:p>
         </w:tc>
@@ -17152,7 +17152,7 @@
                 <w:sz w:val="18"/>
                 <w:szCs w:val="18"/>
               </w:rPr>
-              <w:t xml:space="preserve">Tout utilisateur</w:t>
+              <w:t xml:space="preserve">Administrateur</w:t>
             </w:r>
           </w:p>
         </w:tc>

</xml_diff>